<commit_message>
docs: update CLI Guide, Module Params, and REST API for 3.4.0 (closes NVMESH-8037)
Change-Id: I081837f41c23e9c4a1ba4f315e1fb2668f45bf5b
Signed-off-by: Kobi Shpak <kobi@nvidia.com>
</commit_message>
<xml_diff>
--- a/NVMesh 3.4.0 CLI Guide.docx
+++ b/NVMesh 3.4.0 CLI Guide.docx
@@ -45,7 +45,7 @@
       </w:pPr>
       <w:r>
         <w:rPr/>
-        <w:t>API Version: 15</w:t>
+        <w:t>API Version: 16</w:t>
       </w:r>
     </w:p>
     <w:p>
@@ -1687,7 +1687,7 @@
             </w:tabs>
             <w:rPr/>
           </w:pPr>
-          <w:hyperlink w:anchor="__RefHeading___Toc6319_2394620862">
+          <w:hyperlink w:anchor="__RefHeading___Toc6328_1583066138">
             <w:r>
               <w:rPr>
                 <w:webHidden/>
@@ -2839,7 +2839,7 @@
             </w:tabs>
             <w:rPr/>
           </w:pPr>
-          <w:hyperlink w:anchor="__RefHeading___Toc6321_2394620862">
+          <w:hyperlink w:anchor="__RefHeading___Toc6330_1583066138">
             <w:r>
               <w:rPr>
                 <w:webHidden/>
@@ -2863,7 +2863,7 @@
             </w:tabs>
             <w:rPr/>
           </w:pPr>
-          <w:hyperlink w:anchor="__RefHeading___Toc6323_2394620862">
+          <w:hyperlink w:anchor="__RefHeading___Toc6332_1583066138">
             <w:r>
               <w:rPr>
                 <w:webHidden/>
@@ -2887,7 +2887,7 @@
             </w:tabs>
             <w:rPr/>
           </w:pPr>
-          <w:hyperlink w:anchor="__RefHeading___Toc6325_2394620862">
+          <w:hyperlink w:anchor="__RefHeading___Toc6334_1583066138">
             <w:r>
               <w:rPr>
                 <w:webHidden/>
@@ -2911,7 +2911,7 @@
             </w:tabs>
             <w:rPr/>
           </w:pPr>
-          <w:hyperlink w:anchor="__RefHeading___Toc6327_2394620862">
+          <w:hyperlink w:anchor="__RefHeading___Toc6336_1583066138">
             <w:r>
               <w:rPr>
                 <w:webHidden/>
@@ -2935,7 +2935,7 @@
             </w:tabs>
             <w:rPr/>
           </w:pPr>
-          <w:hyperlink w:anchor="__RefHeading___Toc6329_2394620862">
+          <w:hyperlink w:anchor="__RefHeading___Toc6338_1583066138">
             <w:r>
               <w:rPr>
                 <w:webHidden/>
@@ -2959,7 +2959,7 @@
             </w:tabs>
             <w:rPr/>
           </w:pPr>
-          <w:hyperlink w:anchor="__RefHeading___Toc6331_2394620862">
+          <w:hyperlink w:anchor="__RefHeading___Toc6340_1583066138">
             <w:r>
               <w:rPr>
                 <w:webHidden/>
@@ -2983,7 +2983,7 @@
             </w:tabs>
             <w:rPr/>
           </w:pPr>
-          <w:hyperlink w:anchor="__RefHeading___Toc6333_2394620862">
+          <w:hyperlink w:anchor="__RefHeading___Toc6342_1583066138">
             <w:r>
               <w:rPr>
                 <w:webHidden/>
@@ -3007,7 +3007,7 @@
             </w:tabs>
             <w:rPr/>
           </w:pPr>
-          <w:hyperlink w:anchor="__RefHeading___Toc6335_2394620862">
+          <w:hyperlink w:anchor="__RefHeading___Toc6344_1583066138">
             <w:r>
               <w:rPr>
                 <w:webHidden/>
@@ -3031,7 +3031,7 @@
             </w:tabs>
             <w:rPr/>
           </w:pPr>
-          <w:hyperlink w:anchor="__RefHeading___Toc6337_2394620862">
+          <w:hyperlink w:anchor="__RefHeading___Toc6346_1583066138">
             <w:r>
               <w:rPr>
                 <w:webHidden/>
@@ -3055,7 +3055,7 @@
             </w:tabs>
             <w:rPr/>
           </w:pPr>
-          <w:hyperlink w:anchor="__RefHeading___Toc6339_2394620862">
+          <w:hyperlink w:anchor="__RefHeading___Toc6348_1583066138">
             <w:r>
               <w:rPr>
                 <w:webHidden/>
@@ -3079,7 +3079,7 @@
             </w:tabs>
             <w:rPr/>
           </w:pPr>
-          <w:hyperlink w:anchor="__RefHeading___Toc6341_2394620862">
+          <w:hyperlink w:anchor="__RefHeading___Toc6350_1583066138">
             <w:r>
               <w:rPr>
                 <w:webHidden/>
@@ -3103,7 +3103,7 @@
             </w:tabs>
             <w:rPr/>
           </w:pPr>
-          <w:hyperlink w:anchor="__RefHeading___Toc6343_2394620862">
+          <w:hyperlink w:anchor="__RefHeading___Toc6352_1583066138">
             <w:r>
               <w:rPr>
                 <w:webHidden/>
@@ -3127,7 +3127,7 @@
             </w:tabs>
             <w:rPr/>
           </w:pPr>
-          <w:hyperlink w:anchor="__RefHeading___Toc6345_2394620862">
+          <w:hyperlink w:anchor="__RefHeading___Toc6354_1583066138">
             <w:r>
               <w:rPr>
                 <w:webHidden/>
@@ -3151,7 +3151,7 @@
             </w:tabs>
             <w:rPr/>
           </w:pPr>
-          <w:hyperlink w:anchor="__RefHeading___Toc6347_2394620862">
+          <w:hyperlink w:anchor="__RefHeading___Toc6356_1583066138">
             <w:r>
               <w:rPr>
                 <w:webHidden/>
@@ -3175,7 +3175,7 @@
             </w:tabs>
             <w:rPr/>
           </w:pPr>
-          <w:hyperlink w:anchor="__RefHeading___Toc6349_2394620862">
+          <w:hyperlink w:anchor="__RefHeading___Toc6358_1583066138">
             <w:r>
               <w:rPr>
                 <w:webHidden/>
@@ -3199,7 +3199,7 @@
             </w:tabs>
             <w:rPr/>
           </w:pPr>
-          <w:hyperlink w:anchor="__RefHeading___Toc6351_2394620862">
+          <w:hyperlink w:anchor="__RefHeading___Toc6360_1583066138">
             <w:r>
               <w:rPr>
                 <w:webHidden/>
@@ -3223,7 +3223,7 @@
             </w:tabs>
             <w:rPr/>
           </w:pPr>
-          <w:hyperlink w:anchor="__RefHeading___Toc6353_2394620862">
+          <w:hyperlink w:anchor="__RefHeading___Toc6362_1583066138">
             <w:r>
               <w:rPr>
                 <w:webHidden/>
@@ -3247,7 +3247,7 @@
             </w:tabs>
             <w:rPr/>
           </w:pPr>
-          <w:hyperlink w:anchor="__RefHeading___Toc6355_2394620862">
+          <w:hyperlink w:anchor="__RefHeading___Toc6364_1583066138">
             <w:r>
               <w:rPr>
                 <w:webHidden/>
@@ -10728,15 +10728,15 @@
               <w:br/>
               <w:t xml:space="preserve">  --cli-property TEXT     Enable future properties as --extra-property foo=bar</w:t>
               <w:br/>
+              <w:t xml:space="preserve">  --hosts ID/NAME         Hosts</w:t>
+              <w:br/>
+              <w:t xml:space="preserve">  --config KEY=VALUE      Config</w:t>
+              <w:br/>
+              <w:t xml:space="preserve">  -n, --name TEXT         Name  [required]</w:t>
+              <w:br/>
+              <w:t xml:space="preserve">  --labels TEXT           Labels</w:t>
+              <w:br/>
               <w:t xml:space="preserve">  -d, --description TEXT  Description</w:t>
-              <w:br/>
-              <w:t xml:space="preserve">  --hosts ID/NAME         Hosts</w:t>
-              <w:br/>
-              <w:t xml:space="preserve">  -n, --name TEXT         Name  [required]</w:t>
-              <w:br/>
-              <w:t xml:space="preserve">  --config KEY=VALUE      Config</w:t>
-              <w:br/>
-              <w:t xml:space="preserve">  --labels TEXT           Labels</w:t>
               <w:br/>
               <w:t xml:space="preserve">  -h, --help              Show this message and exit.</w:t>
             </w:r>
@@ -10866,9 +10866,9 @@
               <w:br/>
               <w:t>Options:</w:t>
               <w:br/>
-              <w:t xml:space="preserve">  -n, --name TEXT  [required]</w:t>
-              <w:br/>
-              <w:t xml:space="preserve">  -h, --help       Show this message and exit.</w:t>
+              <w:t xml:space="preserve">  -n, --name ID/NAME  [required]</w:t>
+              <w:br/>
+              <w:t xml:space="preserve">  -h, --help          Show this message and exit.</w:t>
             </w:r>
           </w:p>
         </w:tc>
@@ -11150,13 +11150,15 @@
               <w:br/>
               <w:t xml:space="preserve">  --config KEY=VALUE      Config</w:t>
               <w:br/>
+              <w:t xml:space="preserve">  --delete-config TEXT    Delete key(s) from config</w:t>
+              <w:br/>
+              <w:t xml:space="preserve">  --labels TEXT           Labels</w:t>
+              <w:br/>
+              <w:t xml:space="preserve">  -n, --name ID/NAME      Name  [required]</w:t>
+              <w:br/>
               <w:t xml:space="preserve">  -d, --description TEXT  Description</w:t>
               <w:br/>
-              <w:t xml:space="preserve">  -n, --name ID/NAME      Name  [required]</w:t>
-              <w:br/>
               <w:t xml:space="preserve">  --hosts ID/NAME         Hosts</w:t>
-              <w:br/>
-              <w:t xml:space="preserve">  --labels TEXT           Labels</w:t>
               <w:br/>
               <w:t xml:space="preserve">  -h, --help              Show this message and exit.</w:t>
             </w:r>
@@ -13629,13 +13631,13 @@
               <w:br/>
               <w:t xml:space="preserve">  --cli-property TEXT     Enable future properties as --extra-property foo=bar</w:t>
               <w:br/>
+              <w:t xml:space="preserve">  -d, --description TEXT  Description</w:t>
+              <w:br/>
+              <w:t xml:space="preserve">  -n, --name TEXT         Name  [required]</w:t>
+              <w:br/>
+              <w:t xml:space="preserve">  --drives ID/NAME        Drives</w:t>
+              <w:br/>
               <w:t xml:space="preserve">  --domains DOMAIN        Domains</w:t>
-              <w:br/>
-              <w:t xml:space="preserve">  -n, --name TEXT         Name  [required]</w:t>
-              <w:br/>
-              <w:t xml:space="preserve">  --drives ID/NAME        Drives</w:t>
-              <w:br/>
-              <w:t xml:space="preserve">  -d, --description TEXT  Description</w:t>
               <w:br/>
               <w:t xml:space="preserve">  -h, --help              Show this message and exit.</w:t>
             </w:r>
@@ -13765,9 +13767,9 @@
               <w:br/>
               <w:t>Options:</w:t>
               <w:br/>
-              <w:t xml:space="preserve">  -n, --name TEXT  [required]</w:t>
-              <w:br/>
-              <w:t xml:space="preserve">  -h, --help       Show this message and exit.</w:t>
+              <w:t xml:space="preserve">  -n, --name ID/NAME  [required]</w:t>
+              <w:br/>
+              <w:t xml:space="preserve">  -h, --help          Show this message and exit.</w:t>
             </w:r>
           </w:p>
         </w:tc>
@@ -14047,13 +14049,13 @@
               <w:br/>
               <w:t xml:space="preserve">  --cli-property TEXT     Enable future properties as --extra-property foo=bar</w:t>
               <w:br/>
+              <w:t xml:space="preserve">  --drives ID/NAME        Drives</w:t>
+              <w:br/>
+              <w:t xml:space="preserve">  -d, --description TEXT  Description</w:t>
+              <w:br/>
+              <w:t xml:space="preserve">  --domains DOMAIN        Domains</w:t>
+              <w:br/>
               <w:t xml:space="preserve">  -n, --name ID/NAME      Name  [required]</w:t>
-              <w:br/>
-              <w:t xml:space="preserve">  --drives ID/NAME        Drives</w:t>
-              <w:br/>
-              <w:t xml:space="preserve">  --domains DOMAIN        Domains</w:t>
-              <w:br/>
-              <w:t xml:space="preserve">  -d, --description TEXT  Description</w:t>
               <w:br/>
               <w:t xml:space="preserve">  -h, --help              Show this message and exit.</w:t>
             </w:r>
@@ -14920,10 +14922,17 @@
               <w:t xml:space="preserve">                                  foo=bar</w:t>
               <w:br/>
               <w:br/>
+              <w:t xml:space="preserve">  --logging-level LOGGINGLEVEL    Logging Level (options: ['INFO', 'WARNING',</w:t>
+              <w:br/>
+              <w:t xml:space="preserve">                                  'ERROR', 'DEBUG', 'VERBOSE', 'NONE']</w:t>
+              <w:br/>
+              <w:br/>
               <w:t xml:space="preserve">  --enable-nvmf / --no-enable-nvmf</w:t>
               <w:br/>
               <w:t xml:space="preserve">                                  Enable NVMf</w:t>
               <w:br/>
+              <w:t xml:space="preserve">  --domain TEXT                   Domain</w:t>
+              <w:br/>
               <w:t xml:space="preserve">  --days-before-log-entry-expires INTEGER</w:t>
               <w:br/>
               <w:t xml:space="preserve">                                  Days Before Log Entry Expires</w:t>
@@ -14931,13 +14940,6 @@
               <w:t xml:space="preserve">  --enable-zones / --no-enable-zones</w:t>
               <w:br/>
               <w:t xml:space="preserve">                                  Enable Zones</w:t>
-              <w:br/>
-              <w:t xml:space="preserve">  --domain TEXT                   Domain</w:t>
-              <w:br/>
-              <w:t xml:space="preserve">  --logging-level LOGGINGLEVEL    Logging Level (options: ['INFO', 'WARNING',</w:t>
-              <w:br/>
-              <w:t xml:space="preserve">                                  'ERROR', 'DEBUG', 'VERBOSE', 'NONE']</w:t>
-              <w:br/>
               <w:br/>
               <w:t xml:space="preserve">  -h, --help                      Show this message and exit.</w:t>
             </w:r>
@@ -15598,9 +15600,9 @@
               <w:br/>
               <w:t xml:space="preserve">  --cli-property TEXT     Enable future properties as --extra-property foo=bar</w:t>
               <w:br/>
+              <w:t xml:space="preserve">  -d, --description TEXT  Description</w:t>
+              <w:br/>
               <w:t xml:space="preserve">  -n, --name TEXT         Name  [required]</w:t>
-              <w:br/>
-              <w:t xml:space="preserve">  -d, --description TEXT  Description</w:t>
               <w:br/>
               <w:t xml:space="preserve">  -h, --help              Show this message and exit.</w:t>
             </w:r>
@@ -15730,9 +15732,9 @@
               <w:br/>
               <w:t>Options:</w:t>
               <w:br/>
-              <w:t xml:space="preserve">  -n, --name TEXT  [required]</w:t>
-              <w:br/>
-              <w:t xml:space="preserve">  -h, --help       Show this message and exit.</w:t>
+              <w:t xml:space="preserve">  -n, --name ID/NAME  [required]</w:t>
+              <w:br/>
+              <w:t xml:space="preserve">  -h, --help          Show this message and exit.</w:t>
             </w:r>
           </w:p>
         </w:tc>
@@ -16146,9 +16148,9 @@
               <w:br/>
               <w:t xml:space="preserve">  --cli-property TEXT     Enable future properties as --extra-property foo=bar</w:t>
               <w:br/>
+              <w:t xml:space="preserve">  -d, --description TEXT  Description</w:t>
+              <w:br/>
               <w:t xml:space="preserve">  -n, --name ID/NAME      Name  [required]</w:t>
-              <w:br/>
-              <w:t xml:space="preserve">  -d, --description TEXT  Description</w:t>
               <w:br/>
               <w:t xml:space="preserve">  -h, --help              Show this message and exit.</w:t>
             </w:r>
@@ -18092,7 +18094,7 @@
       <w:r>
         <w:br w:type="page"/>
       </w:r>
-      <w:bookmarkStart w:id="164" w:name="__RefHeading___Toc6319_2394620862"/>
+      <w:bookmarkStart w:id="164" w:name="__RefHeading___Toc6328_1583066138"/>
       <w:bookmarkEnd w:id="164"/>
       <w:r>
         <w:rPr/>
@@ -18158,6 +18160,11 @@
               <w:t>Options:</w:t>
               <w:br/>
               <w:t xml:space="preserve">  -o, --output-format [tabular|rows|json|list]</w:t>
+              <w:br/>
+              <w:t xml:space="preserve">  -f, --fields TEXT               Comma seperated fields to show - case</w:t>
+              <w:br/>
+              <w:t xml:space="preserve">                                  insensitive, use "-" for space</w:t>
+              <w:br/>
               <w:br/>
               <w:t xml:space="preserve">  -h, --help                      Show this message and exit.</w:t>
             </w:r>
@@ -20202,13 +20209,13 @@
               <w:br/>
               <w:t xml:space="preserve">  --cli-property TEXT     Enable future properties as --extra-property foo=bar</w:t>
               <w:br/>
+              <w:t xml:space="preserve">  --targets ID/NAME       Targets</w:t>
+              <w:br/>
+              <w:t xml:space="preserve">  --domains DOMAIN        Domains</w:t>
+              <w:br/>
+              <w:t xml:space="preserve">  -d, --description TEXT  Description</w:t>
+              <w:br/>
               <w:t xml:space="preserve">  -n, --name TEXT         Name  [required]</w:t>
-              <w:br/>
-              <w:t xml:space="preserve">  --targets ID/NAME       Targets</w:t>
-              <w:br/>
-              <w:t xml:space="preserve">  --domains DOMAIN        Domains</w:t>
-              <w:br/>
-              <w:t xml:space="preserve">  -d, --description TEXT  Description</w:t>
               <w:br/>
               <w:t xml:space="preserve">  -h, --help              Show this message and exit.</w:t>
             </w:r>
@@ -20338,9 +20345,9 @@
               <w:br/>
               <w:t>Options:</w:t>
               <w:br/>
-              <w:t xml:space="preserve">  -n, --name TEXT  [required]</w:t>
-              <w:br/>
-              <w:t xml:space="preserve">  -h, --help       Show this message and exit.</w:t>
+              <w:t xml:space="preserve">  -n, --name ID/NAME  [required]</w:t>
+              <w:br/>
+              <w:t xml:space="preserve">  -h, --help          Show this message and exit.</w:t>
             </w:r>
           </w:p>
         </w:tc>
@@ -20620,13 +20627,13 @@
               <w:br/>
               <w:t xml:space="preserve">  --cli-property TEXT     Enable future properties as --extra-property foo=bar</w:t>
               <w:br/>
+              <w:t xml:space="preserve">  --targets ID/NAME       Targets</w:t>
+              <w:br/>
+              <w:t xml:space="preserve">  -n, --name ID/NAME      Name  [required]</w:t>
+              <w:br/>
               <w:t xml:space="preserve">  -d, --description TEXT  Description</w:t>
               <w:br/>
-              <w:t xml:space="preserve">  -n, --name ID/NAME      Name  [required]</w:t>
-              <w:br/>
               <w:t xml:space="preserve">  --domains DOMAIN        Domains</w:t>
-              <w:br/>
-              <w:t xml:space="preserve">  --targets ID/NAME       Targets</w:t>
               <w:br/>
               <w:t xml:space="preserve">  -h, --help              Show this message and exit.</w:t>
             </w:r>
@@ -21412,6 +21419,8 @@
               <w:t xml:space="preserve">                                  foo=bar</w:t>
               <w:br/>
               <w:br/>
+              <w:t xml:space="preserve">  -d, --description TEXT          Description</w:t>
+              <w:br/>
               <w:t xml:space="preserve">  --email TEXT                    Email  [required]</w:t>
               <w:br/>
               <w:t xml:space="preserve">  --notification-level NOTIFICATIONLEVEL</w:t>
@@ -21423,11 +21432,9 @@
               <w:br/>
               <w:t xml:space="preserve">  --role ROLE                     Role (options: ['Admin', 'Observer']</w:t>
               <w:br/>
-              <w:t xml:space="preserve">  -d, --description TEXT          Description</w:t>
+              <w:t xml:space="preserve">  --password TEXT                 Password</w:t>
               <w:br/>
               <w:t xml:space="preserve">  --relogin / --no-relogin        Relogin</w:t>
-              <w:br/>
-              <w:t xml:space="preserve">  --password TEXT                 Password</w:t>
               <w:br/>
               <w:t xml:space="preserve">  -h, --help                      Show this message and exit.</w:t>
             </w:r>
@@ -21557,9 +21564,9 @@
               <w:br/>
               <w:t>Options:</w:t>
               <w:br/>
-              <w:t xml:space="preserve">  -e, --email TEXT  [required]</w:t>
-              <w:br/>
-              <w:t xml:space="preserve">  -h, --help        Show this message and exit.</w:t>
+              <w:t xml:space="preserve">  -e, --email ID/NAME  [required]</w:t>
+              <w:br/>
+              <w:t xml:space="preserve">  -h, --help           Show this message and exit.</w:t>
             </w:r>
           </w:p>
         </w:tc>
@@ -21844,6 +21851,8 @@
               <w:br/>
               <w:t xml:space="preserve">  --email ID/NAME                 Email  [required]</w:t>
               <w:br/>
+              <w:t xml:space="preserve">  -d, --description TEXT          Description</w:t>
+              <w:br/>
               <w:t xml:space="preserve">  --notification-level NOTIFICATIONLEVEL</w:t>
               <w:br/>
               <w:t xml:space="preserve">                                  Notification Level (options: ['NONE',</w:t>
@@ -21852,8 +21861,6 @@
               <w:br/>
               <w:br/>
               <w:t xml:space="preserve">  --role ROLE                     Role (options: ['Admin', 'Observer']</w:t>
-              <w:br/>
-              <w:t xml:space="preserve">  -d, --description TEXT          Description</w:t>
               <w:br/>
               <w:t xml:space="preserve">  -h, --help                      Show this message and exit.</w:t>
             </w:r>
@@ -23059,105 +23066,105 @@
               <w:t xml:space="preserve">                                  foo=bar</w:t>
               <w:br/>
               <w:br/>
+              <w:t xml:space="preserve">  --enabled-nvmf-clients TEXT     Enabled NVMf Clients</w:t>
+              <w:br/>
+              <w:t xml:space="preserve">  --mdv-spec-limit-by-nodes ID/NAME</w:t>
+              <w:br/>
+              <w:t xml:space="preserve">                                  Mdv Spec Limit By Nodes</w:t>
+              <w:br/>
+              <w:t xml:space="preserve">  --mdv-spec-limit-by-disks ID/NAME</w:t>
+              <w:br/>
+              <w:t xml:space="preserve">                                  Mdv Spec Limit By Disks</w:t>
+              <w:br/>
+              <w:t xml:space="preserve">  --mdv-spec-server-classes ID/NAME</w:t>
+              <w:br/>
+              <w:t xml:space="preserve">                                  Mdv Spec Server Classes</w:t>
+              <w:br/>
+              <w:t xml:space="preserve">  --mdv-spec-disk-classes ID/NAME</w:t>
+              <w:br/>
+              <w:t xml:space="preserve">                                  Mdv Spec Disk Classes</w:t>
+              <w:br/>
+              <w:t xml:space="preserve">  --mdv-spec-vpg ID/NAME          Mdv Spec Vpg</w:t>
+              <w:br/>
+              <w:t xml:space="preserve">  --is-read-only / --no-is-read-only</w:t>
+              <w:br/>
+              <w:t xml:space="preserve">                                  Is Read Only</w:t>
+              <w:br/>
+              <w:t xml:space="preserve">  --drive-classes ID/NAME         Drive Classes</w:t>
+              <w:br/>
+              <w:t xml:space="preserve">  --metadata KEY=VALUE            Metadata</w:t>
+              <w:br/>
+              <w:t xml:space="preserve">  -D, --limit-by-disks TEXT       Limit By Disks</w:t>
+              <w:br/>
               <w:t xml:space="preserve">  --nvmf-enabled / --no-nvmf-enabled</w:t>
               <w:br/>
               <w:t xml:space="preserve">                                  NVMf Enabled</w:t>
               <w:br/>
-              <w:t xml:space="preserve">  --enabled-nvmf-clients TEXT     Enabled NVMf Clients</w:t>
-              <w:br/>
-              <w:t xml:space="preserve">  --drive-classes ID/NAME         Drive Classes</w:t>
+              <w:t xml:space="preserve">  --vsgs, --volume-security-group ID/NAME</w:t>
+              <w:br/>
+              <w:t xml:space="preserve">                                  VSGs</w:t>
+              <w:br/>
+              <w:t xml:space="preserve">  --source-id TEXT                Source ID</w:t>
+              <w:br/>
+              <w:t xml:space="preserve">  -T, --limit-by-nodes TEXT       Limit By Nodes</w:t>
               <w:br/>
               <w:t xml:space="preserve">  --relative-rebuild-priority INTEGER</w:t>
               <w:br/>
               <w:t xml:space="preserve">                                  Relative Rebuild Priority</w:t>
               <w:br/>
-              <w:t xml:space="preserve">  -T, --limit-by-nodes TEXT       Limit By Nodes</w:t>
-              <w:br/>
-              <w:t xml:space="preserve">  --vsgs, --volume-security-group ID/NAME</w:t>
-              <w:br/>
-              <w:t xml:space="preserve">                                  VSGs</w:t>
+              <w:t xml:space="preserve">  -d, --description TEXT          Description</w:t>
+              <w:br/>
+              <w:t xml:space="preserve">  --target-classes ID/NAME        Target Classes</w:t>
+              <w:br/>
+              <w:t xml:space="preserve">  --allow-allocation-on-offline-drives / --no-allow-allocation-on-offline-drives</w:t>
+              <w:br/>
+              <w:t xml:space="preserve">                                  Allow Allocation On Offline Drives</w:t>
+              <w:br/>
+              <w:t xml:space="preserve">  -n, --name TEXT                 Name  [required]</w:t>
               <w:br/>
               <w:t xml:space="preserve">  --crc-enabled / --no-crc-enabled</w:t>
               <w:br/>
               <w:t xml:space="preserve">                                  CRC Enabled</w:t>
               <w:br/>
-              <w:t xml:space="preserve">  -d, --description TEXT          Description</w:t>
-              <w:br/>
-              <w:t xml:space="preserve">  --mdv-spec-limit-by-nodes ID/NAME</w:t>
-              <w:br/>
-              <w:t xml:space="preserve">                                  Mdv Spec Limit By Nodes</w:t>
-              <w:br/>
-              <w:t xml:space="preserve">  --mdv-spec-limit-by-disks ID/NAME</w:t>
-              <w:br/>
-              <w:t xml:space="preserve">                                  Mdv Spec Limit By Disks</w:t>
-              <w:br/>
-              <w:t xml:space="preserve">  --mdv-spec-server-classes ID/NAME</w:t>
-              <w:br/>
-              <w:t xml:space="preserve">                                  Mdv Spec Server Classes</w:t>
-              <w:br/>
-              <w:t xml:space="preserve">  --mdv-spec-disk-classes ID/NAME</w:t>
-              <w:br/>
-              <w:t xml:space="preserve">                                  Mdv Spec Disk Classes</w:t>
-              <w:br/>
-              <w:t xml:space="preserve">  --mdv-spec-vpg ID/NAME          Mdv Spec Vpg</w:t>
-              <w:br/>
-              <w:t xml:space="preserve">  --source-id TEXT                Source ID</w:t>
-              <w:br/>
-              <w:t xml:space="preserve">  --target-classes ID/NAME        Target Classes</w:t>
-              <w:br/>
-              <w:t xml:space="preserve">  -D, --limit-by-disks TEXT       Limit By Disks</w:t>
-              <w:br/>
-              <w:t xml:space="preserve">  --allow-allocation-on-offline-drives / --no-allow-allocation-on-offline-drives</w:t>
-              <w:br/>
-              <w:t xml:space="preserve">                                  Allow Allocation On Offline Drives</w:t>
-              <w:br/>
-              <w:t xml:space="preserve">  -n, --name TEXT                 Name  [required]</w:t>
-              <w:br/>
-              <w:t xml:space="preserve">  --metadata KEY=VALUE            Metadata</w:t>
-              <w:br/>
-              <w:t xml:space="preserve">  --is-read-only / --no-is-read-only</w:t>
-              <w:br/>
-              <w:t xml:space="preserve">                                  Is Read Only</w:t>
+              <w:t xml:space="preserve">  --is-encrypted / --no-is-encrypted</w:t>
+              <w:br/>
+              <w:t xml:space="preserve">                                  Is Encrypted</w:t>
+              <w:br/>
+              <w:t xml:space="preserve">  --stripe-width INTEGER          Stripe Width</w:t>
+              <w:br/>
+              <w:t xml:space="preserve">  --protection-level ECSEPARATIONTYPE</w:t>
+              <w:br/>
+              <w:t xml:space="preserve">                                  Protection Level (options: ['ignore',</w:t>
+              <w:br/>
+              <w:t xml:space="preserve">                                  'full', 'minimal']</w:t>
+              <w:br/>
+              <w:br/>
+              <w:t xml:space="preserve">  --vpg TEXT                      Vpg</w:t>
+              <w:br/>
+              <w:t xml:space="preserve">  --encryption-header-size INTEGER</w:t>
+              <w:br/>
+              <w:t xml:space="preserve">                                  Encryption Header Size</w:t>
+              <w:br/>
+              <w:t xml:space="preserve">  --ignore-node-separation / --no-ignore-node-separation</w:t>
+              <w:br/>
+              <w:t xml:space="preserve">                                  Ignore Node Separation</w:t>
+              <w:br/>
+              <w:t xml:space="preserve">  --raid-level, --rl RAIDLEVEL    Raid Level (options: ['ec', 'lvm', '0', '1',</w:t>
+              <w:br/>
+              <w:t xml:space="preserve">                                  '10']</w:t>
+              <w:br/>
+              <w:br/>
+              <w:t xml:space="preserve">  --domain TEXT                   Domain</w:t>
+              <w:br/>
+              <w:t xml:space="preserve">  --number-of-mirrors INTEGER     Number Of Mirrors</w:t>
+              <w:br/>
+              <w:t xml:space="preserve">  -c, --capacity SIZE             Capacity</w:t>
+              <w:br/>
+              <w:t xml:space="preserve">  --stripe-size INTEGER           Stripe Size</w:t>
+              <w:br/>
+              <w:t xml:space="preserve">  --data-blocks INTEGER           Data Blocks</w:t>
               <w:br/>
               <w:t xml:space="preserve">  --parity-blocks INTEGER         Parity Blocks</w:t>
-              <w:br/>
-              <w:t xml:space="preserve">  --encryption-header-size INTEGER</w:t>
-              <w:br/>
-              <w:t xml:space="preserve">                                  Encryption Header Size</w:t>
-              <w:br/>
-              <w:t xml:space="preserve">  --ignore-node-separation / --no-ignore-node-separation</w:t>
-              <w:br/>
-              <w:t xml:space="preserve">                                  Ignore Node Separation</w:t>
-              <w:br/>
-              <w:t xml:space="preserve">  --is-encrypted / --no-is-encrypted</w:t>
-              <w:br/>
-              <w:t xml:space="preserve">                                  Is Encrypted</w:t>
-              <w:br/>
-              <w:t xml:space="preserve">  --raid-level, --rl RAIDLEVEL    Raid Level (options: ['ec', 'lvm', '0', '1',</w:t>
-              <w:br/>
-              <w:t xml:space="preserve">                                  '10']</w:t>
-              <w:br/>
-              <w:br/>
-              <w:t xml:space="preserve">  --vpg TEXT                      Vpg</w:t>
-              <w:br/>
-              <w:t xml:space="preserve">  -c, --capacity SIZE             Capacity</w:t>
-              <w:br/>
-              <w:t xml:space="preserve">  --stripe-size INTEGER           Stripe Size</w:t>
-              <w:br/>
-              <w:t xml:space="preserve">  --stripe-width INTEGER          Stripe Width</w:t>
-              <w:br/>
-              <w:t xml:space="preserve">  --domain TEXT                   Domain</w:t>
-              <w:br/>
-              <w:t xml:space="preserve">  --protection-level ECSEPARATIONTYPE</w:t>
-              <w:br/>
-              <w:t xml:space="preserve">                                  Protection Level (options: ['ignore',</w:t>
-              <w:br/>
-              <w:t xml:space="preserve">                                  'full', 'minimal']</w:t>
-              <w:br/>
-              <w:br/>
-              <w:t xml:space="preserve">  --data-blocks INTEGER           Data Blocks</w:t>
-              <w:br/>
-              <w:t xml:space="preserve">  --number-of-mirrors INTEGER     Number Of Mirrors</w:t>
               <w:br/>
               <w:t xml:space="preserve">  --wait                          Wait for operation to take effect</w:t>
               <w:br/>
@@ -23291,15 +23298,15 @@
               <w:br/>
               <w:t>Options:</w:t>
               <w:br/>
-              <w:t xml:space="preserve">  -n, --name TEXT    [required]</w:t>
-              <w:br/>
-              <w:t xml:space="preserve">  --wait             Wait for operation to take effect</w:t>
-              <w:br/>
-              <w:t xml:space="preserve">  --timeout INTEGER  Seconds to wait (default 60)</w:t>
-              <w:br/>
-              <w:t xml:space="preserve">  -y, --yes          Auto-confirm the operation</w:t>
-              <w:br/>
-              <w:t xml:space="preserve">  -h, --help         Show this message and exit.</w:t>
+              <w:t xml:space="preserve">  -n, --name ID/NAME  [required]</w:t>
+              <w:br/>
+              <w:t xml:space="preserve">  --wait              Wait for operation to take effect</w:t>
+              <w:br/>
+              <w:t xml:space="preserve">  --timeout INTEGER   Seconds to wait (default 60)</w:t>
+              <w:br/>
+              <w:t xml:space="preserve">  -y, --yes           Auto-confirm the operation</w:t>
+              <w:br/>
+              <w:t xml:space="preserve">  -h, --help          Show this message and exit.</w:t>
             </w:r>
           </w:p>
         </w:tc>
@@ -24260,61 +24267,63 @@
               <w:t xml:space="preserve">                                  foo=bar</w:t>
               <w:br/>
               <w:br/>
+              <w:t xml:space="preserve">  --nvmf-enabled / --no-nvmf-enabled</w:t>
+              <w:br/>
+              <w:t xml:space="preserve">                                  NVMf Enabled</w:t>
+              <w:br/>
+              <w:t xml:space="preserve">  -D, --limit-by-disks TEXT       Limit By Disks</w:t>
+              <w:br/>
+              <w:t xml:space="preserve">  --crc-enabled / --no-crc-enabled</w:t>
+              <w:br/>
+              <w:t xml:space="preserve">                                  CRC Enabled</w:t>
+              <w:br/>
+              <w:t xml:space="preserve">  -n, --name ID/NAME              Name  [required]</w:t>
+              <w:br/>
+              <w:t xml:space="preserve">  -T, --limit-by-nodes TEXT       Limit By Nodes</w:t>
+              <w:br/>
               <w:t xml:space="preserve">  --target-classes ID/NAME        Target Classes</w:t>
               <w:br/>
+              <w:t xml:space="preserve">  --vsgs, --volume-security-group ID/NAME</w:t>
+              <w:br/>
+              <w:t xml:space="preserve">                                  VSGs</w:t>
+              <w:br/>
+              <w:t xml:space="preserve">  --drive-classes ID/NAME         Drive Classes</w:t>
+              <w:br/>
               <w:t xml:space="preserve">  --allow-allocation-on-offline-drives / --no-allow-allocation-on-offline-drives</w:t>
               <w:br/>
               <w:t xml:space="preserve">                                  Allow Allocation On Offline Drives</w:t>
               <w:br/>
-              <w:t xml:space="preserve">  -T, --limit-by-nodes TEXT       Limit By Nodes</w:t>
-              <w:br/>
               <w:t xml:space="preserve">  --metadata KEY=VALUE            Metadata</w:t>
               <w:br/>
-              <w:t xml:space="preserve">  -n, --name ID/NAME              Name  [required]</w:t>
+              <w:t xml:space="preserve">  --delete-metadata TEXT          Delete key(s) from metadata</w:t>
+              <w:br/>
+              <w:t xml:space="preserve">  --source-id TEXT                Source ID</w:t>
+              <w:br/>
+              <w:t xml:space="preserve">  -d, --description TEXT          Description</w:t>
+              <w:br/>
+              <w:t xml:space="preserve">  --mdv-spec-limit-by-nodes ID/NAME</w:t>
+              <w:br/>
+              <w:t xml:space="preserve">                                  Mdv Spec Limit By Nodes</w:t>
+              <w:br/>
+              <w:t xml:space="preserve">  --mdv-spec-limit-by-disks ID/NAME</w:t>
+              <w:br/>
+              <w:t xml:space="preserve">                                  Mdv Spec Limit By Disks</w:t>
+              <w:br/>
+              <w:t xml:space="preserve">  --mdv-spec-server-classes ID/NAME</w:t>
+              <w:br/>
+              <w:t xml:space="preserve">                                  Mdv Spec Server Classes</w:t>
+              <w:br/>
+              <w:t xml:space="preserve">  --mdv-spec-disk-classes ID/NAME</w:t>
+              <w:br/>
+              <w:t xml:space="preserve">                                  Mdv Spec Disk Classes</w:t>
+              <w:br/>
+              <w:t xml:space="preserve">  --mdv-spec-vpg ID/NAME          Mdv Spec Vpg</w:t>
+              <w:br/>
+              <w:t xml:space="preserve">  --enabled-nvmf-clients TEXT     Enabled NVMf Clients</w:t>
               <w:br/>
               <w:t xml:space="preserve">  --is-read-only / --no-is-read-only</w:t>
               <w:br/>
               <w:t xml:space="preserve">                                  Is Read Only</w:t>
-              <w:br/>
-              <w:t xml:space="preserve">  --crc-enabled / --no-crc-enabled</w:t>
-              <w:br/>
-              <w:t xml:space="preserve">                                  CRC Enabled</w:t>
-              <w:br/>
-              <w:t xml:space="preserve">  -d, --description TEXT          Description</w:t>
-              <w:br/>
-              <w:t xml:space="preserve">  --drive-classes ID/NAME         Drive Classes</w:t>
-              <w:br/>
-              <w:t xml:space="preserve">  -D, --limit-by-disks TEXT       Limit By Disks</w:t>
-              <w:br/>
-              <w:t xml:space="preserve">  --source-id TEXT                Source ID</w:t>
-              <w:br/>
-              <w:t xml:space="preserve">  --vsgs, --volume-security-group ID/NAME</w:t>
-              <w:br/>
-              <w:t xml:space="preserve">                                  VSGs</w:t>
-              <w:br/>
-              <w:t xml:space="preserve">  --enabled-nvmf-clients TEXT     Enabled NVMf Clients</w:t>
-              <w:br/>
-              <w:t xml:space="preserve">  --mdv-spec-limit-by-nodes ID/NAME</w:t>
-              <w:br/>
-              <w:t xml:space="preserve">                                  Mdv Spec Limit By Nodes</w:t>
-              <w:br/>
-              <w:t xml:space="preserve">  --mdv-spec-limit-by-disks ID/NAME</w:t>
-              <w:br/>
-              <w:t xml:space="preserve">                                  Mdv Spec Limit By Disks</w:t>
-              <w:br/>
-              <w:t xml:space="preserve">  --mdv-spec-server-classes ID/NAME</w:t>
-              <w:br/>
-              <w:t xml:space="preserve">                                  Mdv Spec Server Classes</w:t>
-              <w:br/>
-              <w:t xml:space="preserve">  --mdv-spec-disk-classes ID/NAME</w:t>
-              <w:br/>
-              <w:t xml:space="preserve">                                  Mdv Spec Disk Classes</w:t>
-              <w:br/>
-              <w:t xml:space="preserve">  --mdv-spec-vpg ID/NAME          Mdv Spec Vpg</w:t>
-              <w:br/>
-              <w:t xml:space="preserve">  --nvmf-enabled / --no-nvmf-enabled</w:t>
-              <w:br/>
-              <w:t xml:space="preserve">                                  NVMf Enabled</w:t>
               <w:br/>
               <w:t xml:space="preserve">  --relative-rebuild-priority INTEGER</w:t>
               <w:br/>
@@ -25146,9 +25155,9 @@
               <w:br/>
               <w:t xml:space="preserve">  --cli-property TEXT     Enable future properties as --extra-property foo=bar</w:t>
               <w:br/>
+              <w:t xml:space="preserve">  -d, --description TEXT  Description</w:t>
+              <w:br/>
               <w:t xml:space="preserve">  --key-pairs TEXT        Key Pairs</w:t>
-              <w:br/>
-              <w:t xml:space="preserve">  -d, --description TEXT  Description</w:t>
               <w:br/>
               <w:t xml:space="preserve">  -n, --name TEXT         Name  [required]</w:t>
               <w:br/>
@@ -25280,9 +25289,9 @@
               <w:br/>
               <w:t>Options:</w:t>
               <w:br/>
-              <w:t xml:space="preserve">  -n, --name TEXT  [required]</w:t>
-              <w:br/>
-              <w:t xml:space="preserve">  -h, --help       Show this message and exit.</w:t>
+              <w:t xml:space="preserve">  -n, --name ID/NAME  [required]</w:t>
+              <w:br/>
+              <w:t xml:space="preserve">  -h, --help          Show this message and exit.</w:t>
             </w:r>
           </w:p>
         </w:tc>
@@ -26204,67 +26213,67 @@
               <w:t xml:space="preserve">                                  foo=bar</w:t>
               <w:br/>
               <w:br/>
+              <w:t xml:space="preserve">  -n, --name TEXT                 Name  [required]</w:t>
+              <w:br/>
+              <w:t xml:space="preserve">  --vsgs, --volume-security-group ID/NAME</w:t>
+              <w:br/>
+              <w:t xml:space="preserve">                                  VSGs</w:t>
+              <w:br/>
               <w:t xml:space="preserve">  -d, --description TEXT          Description</w:t>
               <w:br/>
               <w:t xml:space="preserve">  --allow-allocation-on-offline-drives / --no-allow-allocation-on-offline-drives</w:t>
               <w:br/>
               <w:t xml:space="preserve">                                  Allow Allocation On Offline Drives</w:t>
               <w:br/>
-              <w:t xml:space="preserve">  -n, --name TEXT                 Name  [required]</w:t>
-              <w:br/>
-              <w:t xml:space="preserve">  --vsgs, --volume-security-group ID/NAME</w:t>
-              <w:br/>
-              <w:t xml:space="preserve">                                  VSGs</w:t>
+              <w:t xml:space="preserve">  --ignore-node-separation / --no-ignore-node-separation</w:t>
+              <w:br/>
+              <w:t xml:space="preserve">                                  Ignore Node Separation</w:t>
+              <w:br/>
+              <w:t xml:space="preserve">  --crc-enabled / --no-crc-enabled</w:t>
+              <w:br/>
+              <w:t xml:space="preserve">                                  CRC Enabled</w:t>
+              <w:br/>
+              <w:t xml:space="preserve">  --data-blocks INTEGER           Data Blocks</w:t>
               <w:br/>
               <w:t xml:space="preserve">  --is-encrypted / --no-is-encrypted</w:t>
               <w:br/>
               <w:t xml:space="preserve">                                  Is Encrypted</w:t>
               <w:br/>
-              <w:t xml:space="preserve">  --crc-enabled / --no-crc-enabled</w:t>
-              <w:br/>
-              <w:t xml:space="preserve">                                  CRC Enabled</w:t>
+              <w:t xml:space="preserve">  --target-classes ID/NAME        Target Classes</w:t>
+              <w:br/>
+              <w:t xml:space="preserve">  --raid-level, --rl RAIDLEVEL    Raid Level (options: ['ec', 'lvm', '0', '1',</w:t>
+              <w:br/>
+              <w:t xml:space="preserve">                                  '10']</w:t>
+              <w:br/>
+              <w:br/>
+              <w:t xml:space="preserve">  --stripe-size INTEGER           Stripe Size</w:t>
+              <w:br/>
+              <w:t xml:space="preserve">  --number-of-mirrors INTEGER     Number Of Mirrors</w:t>
               <w:br/>
               <w:t xml:space="preserve">  --allow-overflow / --no-allow-overflow</w:t>
               <w:br/>
               <w:t xml:space="preserve">                                  Allow Overflow</w:t>
               <w:br/>
+              <w:t xml:space="preserve">  --domain TEXT                   Domain</w:t>
+              <w:br/>
+              <w:t xml:space="preserve">  --drive-classes ID/NAME         Drive Classes</w:t>
+              <w:br/>
+              <w:t xml:space="preserve">  --protection-level ECSEPARATIONTYPE</w:t>
+              <w:br/>
+              <w:t xml:space="preserve">                                  Protection Level (options: ['ignore',</w:t>
+              <w:br/>
+              <w:t xml:space="preserve">                                  'full', 'minimal']</w:t>
+              <w:br/>
+              <w:br/>
               <w:t xml:space="preserve">  --encryption-header-size INTEGER</w:t>
               <w:br/>
               <w:t xml:space="preserve">                                  Encryption Header Size</w:t>
               <w:br/>
-              <w:t xml:space="preserve">  --data-blocks INTEGER           Data Blocks</w:t>
-              <w:br/>
-              <w:t xml:space="preserve">  --drive-classes ID/NAME         Drive Classes</w:t>
-              <w:br/>
               <w:t xml:space="preserve">  -c, --capacity SIZE             Capacity</w:t>
               <w:br/>
-              <w:t xml:space="preserve">  --domain TEXT                   Domain</w:t>
-              <w:br/>
-              <w:t xml:space="preserve">  --number-of-mirrors INTEGER     Number Of Mirrors</w:t>
+              <w:t xml:space="preserve">  --stripe-width INTEGER          Stripe Width</w:t>
               <w:br/>
               <w:t xml:space="preserve">  --parity-blocks INTEGER         Parity Blocks</w:t>
-              <w:br/>
-              <w:t xml:space="preserve">  --protection-level ECSEPARATIONTYPE</w:t>
-              <w:br/>
-              <w:t xml:space="preserve">                                  Protection Level (options: ['ignore',</w:t>
-              <w:br/>
-              <w:t xml:space="preserve">                                  'full', 'minimal']</w:t>
-              <w:br/>
-              <w:br/>
-              <w:t xml:space="preserve">  --raid-level, --rl RAIDLEVEL    Raid Level (options: ['ec', 'lvm', '0', '1',</w:t>
-              <w:br/>
-              <w:t xml:space="preserve">                                  '10']</w:t>
-              <w:br/>
-              <w:br/>
-              <w:t xml:space="preserve">  --stripe-width INTEGER          Stripe Width</w:t>
-              <w:br/>
-              <w:t xml:space="preserve">  --target-classes ID/NAME        Target Classes</w:t>
-              <w:br/>
-              <w:t xml:space="preserve">  --ignore-node-separation / --no-ignore-node-separation</w:t>
-              <w:br/>
-              <w:t xml:space="preserve">                                  Ignore Node Separation</w:t>
-              <w:br/>
-              <w:t xml:space="preserve">  --stripe-size INTEGER           Stripe Size</w:t>
               <w:br/>
               <w:t xml:space="preserve">  -h, --help                      Show this message and exit.</w:t>
             </w:r>
@@ -26394,9 +26403,9 @@
               <w:br/>
               <w:t>Options:</w:t>
               <w:br/>
-              <w:t xml:space="preserve">  -n, --name TEXT  [required]</w:t>
-              <w:br/>
-              <w:t xml:space="preserve">  -h, --help       Show this message and exit.</w:t>
+              <w:t xml:space="preserve">  -n, --name ID/NAME  [required]</w:t>
+              <w:br/>
+              <w:t xml:space="preserve">  -h, --help          Show this message and exit.</w:t>
             </w:r>
           </w:p>
         </w:tc>
@@ -26694,7 +26703,7 @@
       <w:r>
         <w:br w:type="page"/>
       </w:r>
-      <w:bookmarkStart w:id="259" w:name="__RefHeading___Toc6321_2394620862"/>
+      <w:bookmarkStart w:id="259" w:name="__RefHeading___Toc6330_1583066138"/>
       <w:bookmarkEnd w:id="259"/>
       <w:r>
         <w:rPr/>
@@ -26770,13 +26779,13 @@
               <w:br/>
               <w:t xml:space="preserve">                                  Allow Allocation On Offline Drives</w:t>
               <w:br/>
+              <w:t xml:space="preserve">  -n, --name ID/NAME              Name  [required]</w:t>
+              <w:br/>
               <w:t xml:space="preserve">  --vsgs, --volume-security-group ID/NAME</w:t>
               <w:br/>
               <w:t xml:space="preserve">                                  VSGs</w:t>
               <w:br/>
               <w:t xml:space="preserve">  -d, --description TEXT          Description</w:t>
-              <w:br/>
-              <w:t xml:space="preserve">  -n, --name ID/NAME              Name  [required]</w:t>
               <w:br/>
               <w:t xml:space="preserve">  -h, --help                      Show this message and exit.</w:t>
             </w:r>
@@ -26862,7 +26871,7 @@
         <w:pStyle w:val="Heading2"/>
         <w:rPr/>
       </w:pPr>
-      <w:bookmarkStart w:id="260" w:name="__RefHeading___Toc6323_2394620862"/>
+      <w:bookmarkStart w:id="260" w:name="__RefHeading___Toc6332_1583066138"/>
       <w:bookmarkEnd w:id="260"/>
       <w:r>
         <w:rPr/>
@@ -26955,7 +26964,7 @@
       <w:r>
         <w:br w:type="page"/>
       </w:r>
-      <w:bookmarkStart w:id="261" w:name="__RefHeading___Toc6325_2394620862"/>
+      <w:bookmarkStart w:id="261" w:name="__RefHeading___Toc6334_1583066138"/>
       <w:bookmarkEnd w:id="261"/>
       <w:r>
         <w:rPr/>
@@ -27034,7 +27043,7 @@
       <w:r>
         <w:br w:type="page"/>
       </w:r>
-      <w:bookmarkStart w:id="262" w:name="__RefHeading___Toc6327_2394620862"/>
+      <w:bookmarkStart w:id="262" w:name="__RefHeading___Toc6336_1583066138"/>
       <w:bookmarkEnd w:id="262"/>
       <w:r>
         <w:rPr/>
@@ -27106,29 +27115,29 @@
               <w:t xml:space="preserve">                                  foo=bar</w:t>
               <w:br/>
               <w:br/>
+              <w:t xml:space="preserve">  --max-errors-threshold INTEGER  Max Errors Threshold</w:t>
+              <w:br/>
+              <w:t xml:space="preserve">  --min-redundancy-level UPGRADEREDUNDANCYLEVELS</w:t>
+              <w:br/>
+              <w:t xml:space="preserve">                                  Min Redundancy Level (options: ['minimal',</w:t>
+              <w:br/>
+              <w:t xml:space="preserve">                                  'max', 'none']</w:t>
+              <w:br/>
+              <w:br/>
+              <w:t xml:space="preserve">  --machines-to-upgrade ID/NAME   Machines To Upgrade</w:t>
+              <w:br/>
+              <w:t xml:space="preserve">  --destination-version TEXT      Destination Version</w:t>
+              <w:br/>
+              <w:t xml:space="preserve">  --execution-mode UPGRADEEXECUTIONMODES</w:t>
+              <w:br/>
+              <w:t xml:space="preserve">                                  Execution Mode (options: ['manual',</w:t>
+              <w:br/>
+              <w:t xml:space="preserve">                                  'manualStart', 'automatic']</w:t>
+              <w:br/>
+              <w:br/>
               <w:t xml:space="preserve">  --skip-machines-on-failure / --no-skip-machines-on-failure</w:t>
               <w:br/>
               <w:t xml:space="preserve">                                  Skip Machines On Failure</w:t>
-              <w:br/>
-              <w:t xml:space="preserve">  --execution-mode UPGRADEEXECUTIONMODES</w:t>
-              <w:br/>
-              <w:t xml:space="preserve">                                  Execution Mode (options: ['MANUAL',</w:t>
-              <w:br/>
-              <w:t xml:space="preserve">                                  'MANUAL_START', 'AUTOMATIC']</w:t>
-              <w:br/>
-              <w:br/>
-              <w:t xml:space="preserve">  --destination-version TEXT      Destination Version</w:t>
-              <w:br/>
-              <w:t xml:space="preserve">  --min-redundancy-level UPGRADEREDUNDANCYLEVELS</w:t>
-              <w:br/>
-              <w:t xml:space="preserve">                                  Min Redundancy Level (options: ['MINIMAL',</w:t>
-              <w:br/>
-              <w:t xml:space="preserve">                                  'MAX', 'NONE']</w:t>
-              <w:br/>
-              <w:br/>
-              <w:t xml:space="preserve">  --machines-to-upgrade ID/NAME   Machines To Upgrade</w:t>
-              <w:br/>
-              <w:t xml:space="preserve">  --max-errors-threshold INTEGER  Max Errors Threshold</w:t>
               <w:br/>
               <w:t xml:space="preserve">  --max-concurrent-clients INTEGER</w:t>
               <w:br/>
@@ -27148,7 +27157,7 @@
       <w:r>
         <w:br w:type="page"/>
       </w:r>
-      <w:bookmarkStart w:id="263" w:name="__RefHeading___Toc6329_2394620862"/>
+      <w:bookmarkStart w:id="263" w:name="__RefHeading___Toc6338_1583066138"/>
       <w:bookmarkEnd w:id="263"/>
       <w:r>
         <w:rPr/>
@@ -27213,9 +27222,9 @@
               <w:br/>
               <w:t>Options:</w:t>
               <w:br/>
-              <w:t xml:space="preserve">  -u, --uuid TEXT  [required]</w:t>
-              <w:br/>
-              <w:t xml:space="preserve">  -h, --help       Show this message and exit.</w:t>
+              <w:t xml:space="preserve">  -u, --uuid ID/NAME  [required]</w:t>
+              <w:br/>
+              <w:t xml:space="preserve">  -h, --help          Show this message and exit.</w:t>
             </w:r>
           </w:p>
         </w:tc>
@@ -27229,7 +27238,7 @@
       <w:r>
         <w:br w:type="page"/>
       </w:r>
-      <w:bookmarkStart w:id="264" w:name="__RefHeading___Toc6331_2394620862"/>
+      <w:bookmarkStart w:id="264" w:name="__RefHeading___Toc6340_1583066138"/>
       <w:bookmarkEnd w:id="264"/>
       <w:r>
         <w:rPr/>
@@ -27310,7 +27319,7 @@
       <w:r>
         <w:br w:type="page"/>
       </w:r>
-      <w:bookmarkStart w:id="265" w:name="__RefHeading___Toc6333_2394620862"/>
+      <w:bookmarkStart w:id="265" w:name="__RefHeading___Toc6342_1583066138"/>
       <w:bookmarkEnd w:id="265"/>
       <w:r>
         <w:rPr/>
@@ -27409,7 +27418,7 @@
       <w:r>
         <w:br w:type="page"/>
       </w:r>
-      <w:bookmarkStart w:id="266" w:name="__RefHeading___Toc6335_2394620862"/>
+      <w:bookmarkStart w:id="266" w:name="__RefHeading___Toc6344_1583066138"/>
       <w:bookmarkEnd w:id="266"/>
       <w:r>
         <w:rPr/>
@@ -27490,7 +27499,7 @@
       <w:r>
         <w:br w:type="page"/>
       </w:r>
-      <w:bookmarkStart w:id="267" w:name="__RefHeading___Toc6337_2394620862"/>
+      <w:bookmarkStart w:id="267" w:name="__RefHeading___Toc6346_1583066138"/>
       <w:bookmarkEnd w:id="267"/>
       <w:r>
         <w:rPr/>
@@ -27571,7 +27580,7 @@
       <w:r>
         <w:br w:type="page"/>
       </w:r>
-      <w:bookmarkStart w:id="268" w:name="__RefHeading___Toc6339_2394620862"/>
+      <w:bookmarkStart w:id="268" w:name="__RefHeading___Toc6348_1583066138"/>
       <w:bookmarkEnd w:id="268"/>
       <w:r>
         <w:rPr/>
@@ -27656,7 +27665,7 @@
       <w:r>
         <w:br w:type="page"/>
       </w:r>
-      <w:bookmarkStart w:id="269" w:name="__RefHeading___Toc6341_2394620862"/>
+      <w:bookmarkStart w:id="269" w:name="__RefHeading___Toc6350_1583066138"/>
       <w:bookmarkEnd w:id="269"/>
       <w:r>
         <w:rPr/>
@@ -27735,7 +27744,7 @@
       <w:r>
         <w:br w:type="page"/>
       </w:r>
-      <w:bookmarkStart w:id="270" w:name="__RefHeading___Toc6343_2394620862"/>
+      <w:bookmarkStart w:id="270" w:name="__RefHeading___Toc6352_1583066138"/>
       <w:bookmarkEnd w:id="270"/>
       <w:r>
         <w:rPr/>
@@ -27816,7 +27825,7 @@
       <w:r>
         <w:br w:type="page"/>
       </w:r>
-      <w:bookmarkStart w:id="271" w:name="__RefHeading___Toc6345_2394620862"/>
+      <w:bookmarkStart w:id="271" w:name="__RefHeading___Toc6354_1583066138"/>
       <w:bookmarkEnd w:id="271"/>
       <w:r>
         <w:rPr/>
@@ -27915,7 +27924,7 @@
       <w:r>
         <w:br w:type="page"/>
       </w:r>
-      <w:bookmarkStart w:id="272" w:name="__RefHeading___Toc6347_2394620862"/>
+      <w:bookmarkStart w:id="272" w:name="__RefHeading___Toc6356_1583066138"/>
       <w:bookmarkEnd w:id="272"/>
       <w:r>
         <w:rPr/>
@@ -28002,7 +28011,7 @@
       <w:r>
         <w:br w:type="page"/>
       </w:r>
-      <w:bookmarkStart w:id="273" w:name="__RefHeading___Toc6349_2394620862"/>
+      <w:bookmarkStart w:id="273" w:name="__RefHeading___Toc6358_1583066138"/>
       <w:bookmarkEnd w:id="273"/>
       <w:r>
         <w:rPr/>
@@ -28081,7 +28090,7 @@
       <w:r>
         <w:br w:type="page"/>
       </w:r>
-      <w:bookmarkStart w:id="274" w:name="__RefHeading___Toc6351_2394620862"/>
+      <w:bookmarkStart w:id="274" w:name="__RefHeading___Toc6360_1583066138"/>
       <w:bookmarkEnd w:id="274"/>
       <w:r>
         <w:rPr/>
@@ -28162,7 +28171,7 @@
       <w:r>
         <w:br w:type="page"/>
       </w:r>
-      <w:bookmarkStart w:id="275" w:name="__RefHeading___Toc6353_2394620862"/>
+      <w:bookmarkStart w:id="275" w:name="__RefHeading___Toc6362_1583066138"/>
       <w:bookmarkEnd w:id="275"/>
       <w:r>
         <w:rPr/>
@@ -28245,7 +28254,7 @@
       <w:r>
         <w:br w:type="page"/>
       </w:r>
-      <w:bookmarkStart w:id="276" w:name="__RefHeading___Toc6355_2394620862"/>
+      <w:bookmarkStart w:id="276" w:name="__RefHeading___Toc6364_1583066138"/>
       <w:bookmarkEnd w:id="276"/>
       <w:r>
         <w:rPr/>
@@ -28532,7 +28541,7 @@
       <w:rPr>
         <w:rFonts w:cs="NVIDIA Sans" w:ascii="NVIDIA Sans" w:hAnsi="NVIDIA Sans"/>
       </w:rPr>
-      <w:t>130</w:t>
+      <w:t>134</w:t>
     </w:r>
     <w:r>
       <w:rPr>

</xml_diff>